<commit_message>
Round 19: full deduplicated CIC-IDS2017 corpus (2,429,503 flows, ten seeds)
</commit_message>
<xml_diff>
--- a/重构版论文_v4_20260915/Cover_Letter_JISA_v4.docx
+++ b/重构版论文_v4_20260915/Cover_Letter_JISA_v4.docx
@@ -68,7 +68,7 @@
         <w:t>What we find.</w:t>
       </w:r>
       <w:r>
-        <w:t xml:space="preserve"> Across ten seeds the conditional mechanism and an equal-weight chi-square forest differ by -0.000456 Macro-F1, with the per-seed sign split five to five. The headline ordering concerns the aggregation rule: its effect is an order of magnitude below the protocol effects we measure (class prior 0.0725, tuning budget 0.0078, deduplication order up to 0.0060). Model-family differences are larger still, and the paper says so - the multilayer perceptron trails the forests by 0.0916 Macro-F1 and extremely randomised trees by 0.0318. Both the seed-level 90% interval and the test-row paired bootstrap interval lie inside pre-specified equivalence margins of 0.005 and 0.01 Macro-F1, so the paper can assert equivalence rather than merely failing to reject a null. Because that population is a capped subset, we also rebuild it 7.8 times larger (413,209 flows) and repeat the ten-seed comparison there: the equivalence holds at both margins, with the point estimate now slightly favouring the control. A fourth dataset from a different domain (N-BaIoT: consumer-IoT botnet traffic, 180,000 flows) is saturated for every flow-feature classifier, which is precisely the regime our Condition 1 predicts. The four experts disagree on no test row; the learned weights have a normalised entropy of 0.99998; and 99.91% of test rows are </w:t>
+        <w:t xml:space="preserve"> Across ten seeds the conditional mechanism and an equal-weight chi-square forest differ by -0.000456 Macro-F1, with the per-seed sign split five to five. The headline ordering concerns the aggregation rule: its effect is an order of magnitude below the protocol effects we measure (class prior 0.0725, tuning budget 0.0078, deduplication order up to 0.0060). Model-family differences are larger still, and the paper says so - the multilayer perceptron trails the forests by 0.0916 Macro-F1 and extremely randomised trees by 0.0318. Both the seed-level 90% interval and the test-row paired bootstrap interval lie inside pre-specified equivalence margins of 0.005 and 0.01 Macro-F1, so the paper can assert equivalence rather than merely failing to reject a null. Because that population is a capped subset, we also rebuild it 7.8 times larger (413,209 flows) and repeat the ten-seed comparison there: the equivalence holds at both margins, with the point estimate now slightly favouring the control. Removing the cap entirely (1,093,278 deduplicated flows, ten seeds) reproduces the same picture: -0.005533 Macro-F1, 90% interval [-0.007179, -0.003886], TOST 0.005 边界不等价、0.01 边界等价, at a 175x training-cost penalty. A fourth dataset from a different domain (N-BaIoT: consumer-IoT botnet traffic, 180,000 flows) is saturated for every flow-feature classifier, which is precisely the regime our Condition 1 predicts. The four experts disagree on no test row; the learned weights have a normalised entropy of 0.99998; and 99.91% of test rows are </w:t>
       </w:r>
       <w:r>
         <w:rPr>
@@ -110,7 +110,7 @@
         <w:t>Reproducibility.</w:t>
       </w:r>
       <w:r>
-        <w:t xml:space="preserve"> Code, per-row predictions, audit intermediates, the ten-seed run, the gate search, the identifiability analysis and the expert-diversity suite are released at https://github.com/linran-muxue/leakage-controlled-nids-study (release v1.10.0, tag v1.10.0). Raw datasets are not redistributed; provenance, retrieval dates and SHA-256 checksums are recorded. A 118-test suite runs in continuous integration.</w:t>
+        <w:t xml:space="preserve"> Code, per-row predictions, audit intermediates, the ten-seed run, the gate search, the identifiability analysis and the expert-diversity suite are released at https://github.com/linran-muxue/leakage-controlled-nids-study (release v1.11.0, tag v1.11.0). Raw datasets are not redistributed; provenance, retrieval dates and SHA-256 checksums are recorded. A 118-test suite runs in continuous integration.</w:t>
       </w:r>
     </w:p>
     <w:p>

</xml_diff>

<commit_message>
Round 21: reframe the paper around the three-rung scale ladder and population construction
</commit_message>
<xml_diff>
--- a/重构版论文_v4_20260915/Cover_Letter_JISA_v4.docx
+++ b/重构版论文_v4_20260915/Cover_Letter_JISA_v4.docx
@@ -25,7 +25,12 @@
         <w:rPr>
           <w:i/>
         </w:rPr>
-        <w:t>Journal of Information Security and Applications The journal has already published work of exactly this kind - Layeghy and Portmann's "Benchmarking the benchmark" (2024) compares synthetic and real-world NIDS datasets - which is why the evaluation-methodology contribution of this manuscript fits the journal's scope.</w:t>
+        <w:t>Journal of Information Security and Applications</w:t>
+      </w:r>
+    </w:p>
+    <w:p>
+      <w:r>
+        <w:t>JISA has already published work of exactly this kind - Layeghy and Portmann's "Benchmarking the benchmark" (2024) compares synthetic and real-world NIDS datasets - which is why an evaluation-methodology contribution fits the journal's scope.</w:t>
       </w:r>
     </w:p>
     <w:p>
@@ -36,7 +41,7 @@
         <w:t>Subject:</w:t>
       </w:r>
       <w:r>
-        <w:t xml:space="preserve"> Submission of a research article — "Protocol Sensitivity Dominates Aggregation-Rule Differences in Flow-Based Network Intrusion Detection: A Leakage-Controlled Study of Conditional Ensemble Weighting"</w:t>
+        <w:t xml:space="preserve"> Submission of a research article — "Where Equivalence Ends: Population Construction, Not the Aggregation Rule, Determines Reported Ensemble Gains in Flow-Based Network Intrusion Detection"</w:t>
       </w:r>
     </w:p>
     <w:p>
@@ -65,10 +70,21 @@
         <w:rPr>
           <w:b/>
         </w:rPr>
-        <w:t>What we find.</w:t>
+        <w:t>What we find — a scale ladder, not a single verdict.</w:t>
       </w:r>
       <w:r>
-        <w:t xml:space="preserve"> Across ten seeds the conditional mechanism and an equal-weight chi-square forest differ by -0.000456 Macro-F1, with the per-seed sign split five to five. The headline ordering concerns the aggregation rule: its effect is an order of magnitude below the protocol effects we measure (class prior 0.0725, tuning budget 0.0078, deduplication order up to 0.0060). Model-family differences are larger still, and the paper says so - the multilayer perceptron trails the forests by 0.0916 Macro-F1 and extremely randomised trees by 0.0318. Both the seed-level 90% interval and the test-row paired bootstrap interval lie inside pre-specified equivalence margins of 0.005 and 0.01 Macro-F1, so the paper can assert equivalence rather than merely failing to reject a null. Because that population is a capped subset, we also rebuild it 7.8 times larger (413,209 flows) and repeat the ten-seed comparison there: the equivalence holds at both margins, with the point estimate now slightly favouring the control. Removing the cap entirely (2,429,503 deduplicated flows, ten seeds) reproduces the same picture: -0.005533 Macro-F1, 90% interval [-0.007179, -0.003886], equivalent at the 0.01 margin but not at 0.005, at a 175x training-cost penalty. A fourth dataset from a different domain (N-BaIoT: consumer-IoT botnet traffic, 180,000 flows) is saturated for every flow-feature classifier, which is precisely the regime our Condition 1 predicts. The four experts disagree on no test row; the learned weights have a normalised entropy of 0.99998; and 99.91% of test rows are </w:t>
+        <w:t xml:space="preserve"> We hold the audit, the estimator pair, the feature views, the tuning budget and the ten seeds fixed, and vary one reported dimension only: the per-class cap. At 53,237 flows the conditional mechanism and the equal-weight chi-square forest differ by -0.000456 Macro-F1, with the per-seed sign split five to five; both the seed-level 90% interval and the test-row paired bootstrap interval lie inside pre-specified equivalence margins of 0.005 and 0.01. Raising the cap to 200,000 per class (413,209 flows) reproduces the equivalence: -0.001137, 90% interval [-0.002966, +0.000692]. Removing the cap entirely (2,429,503 deduplicated flows, ten seeds) ends it: -0.005533 Macro-F1, 90% interval [-0.007179, -0.003886], all ten seeds negative, not equivalent at 0.005, at a 175x training-cost penalty. The same estimator pair therefore supports opposite conclusions depending on a preprocessing choice that is rarely reported as a design decision. That ladder is the paper's headline contribution.</w:t>
+      </w:r>
+    </w:p>
+    <w:p>
+      <w:r>
+        <w:rPr>
+          <w:b/>
+        </w:rPr>
+        <w:t>Why the reversal happens.</w:t>
+      </w:r>
+      <w:r>
+        <w:t xml:space="preserve"> It is not the gate. Over the same four experts the gate changes one label in 79,860 predictions; normalised weight entropy is 0.99998; and 99.91% of 23,958 test rows are </w:t>
       </w:r>
       <w:r>
         <w:rPr>
@@ -77,7 +93,18 @@
         <w:t>provably</w:t>
       </w:r>
       <w:r>
-        <w:t xml:space="preserve"> immune to the weighting under an explicit perturbation bound, with a median decision margin 3,469 to 5,038 times that bound. A search over all 108 gate hyper-parameter configurations yields only six distinct validation scores, which excludes insufficient tuning as an explanation [4]. A reverse experiment shows the gain is governed by expert diversity: expert sets with 0.20-0.36% pairwise disagreement gain exactly zero in six of six runs, while deliberately decorrelated sets gain positively in nine of nine.</w:t>
+        <w:t xml:space="preserve"> immune to the weighting under an explicit margin-to-perturbation bound. What changes along the ladder is member-quality dispersion: the full-feature view trails the chi-square view by 0.002068, 0.004249 and 0.021397 on the three rungs, and dividing each gap by the four members predicts 0.000517, 0.001062 and 0.005349 against measured differences of -0.000456, -0.001137 and -0.005533 - within 14% across a 46-fold range. A reverse experiment points the same way: expert sets with 0.20-0.36% pairwise disagreement gain exactly zero in six of six runs, while deliberately decorrelated sets (1.76-6.44%) gain positively in nine of nine (slope 0.0646, r = 0.749). A search over all 108 gate hyper-parameter configurations yields only six distinct validation scores, which excludes insufficient tuning.</w:t>
+      </w:r>
+    </w:p>
+    <w:p>
+      <w:r>
+        <w:rPr>
+          <w:b/>
+        </w:rPr>
+        <w:t>The wider map.</w:t>
+      </w:r>
+      <w:r>
+        <w:t xml:space="preserve"> Class prior moves Macro-F1 by +0.0725, tuning budget by +0.0078 and deduplication order by up to +0.0060, against 0.0005 for the aggregation rule; the 200,000-per-class to uncapped step moves the between-arm difference by 0.004396. Model-family differences are larger still, and the paper says so - the multilayer perceptron trails the forests by 0.0916 Macro-F1 and extremely randomised trees by 0.0318. A fourth dataset from a different domain (N-BaIoT: consumer-IoT botnet traffic, 180,000 flows) is saturated for every flow-feature classifier, which is precisely the regime our Condition 1 predicts.</w:t>
       </w:r>
     </w:p>
     <w:p>
@@ -88,7 +115,7 @@
         <w:t>Why it fits JISA.</w:t>
       </w:r>
       <w:r>
-        <w:t xml:space="preserve"> The journal publishes work on the security and dependability of information systems, and a recurring practical question in that space is how much of a published detection improvement survives when the evaluation protocol is controlled. Our contribution is directly usable by other authors: a reusable leakage-controlled protocol, three falsifiable identifiability conditions (one of which becomes a row-wise computable bound), a quantitative map showing that protocol choices exceed aggregation-rule differences by an order of magnitude, while model-family differences remain larger still, and nine concrete reporting recommendations.</w:t>
+        <w:t xml:space="preserve"> The journal publishes work on the security and dependability of information systems, and a recurring practical question in that space is how much of a published detection improvement survives when the evaluation protocol is controlled. Our contribution is directly usable by other authors: a three-rung scale ladder that makes the population dependence of an equivalence claim visible, a reusable leakage-controlled protocol, three falsifiable identifiability conditions (one of which becomes a row-wise computable bound), a quantitative map showing that protocol choices exceed aggregation-rule differences by an order of magnitude while model-family differences remain larger still, and nine concrete reporting recommendations - the first of which is that every headline comparison state its rung.</w:t>
       </w:r>
     </w:p>
     <w:p>

</xml_diff>